<commit_message>
build(dist): fix figure resource-path so chapter/CD figures embed in DOCX
build_ctu_docx.sh: add --resource-path=.:thesis to PANDOC_VI (resolves
figures/fig_4_*, fig_5_* referenced in CD1 parts/chapters from thesis/figures/);
fix P3 VI manuscript build to cd into p3/ like P4/P5 (embeds figures/vietnam/*).
Regenerated dossier DOCX: 15_part2_findings now embeds 6 figures, p3_vietnam_vi
embeds 6. Remaining warning: fig_5_6_mongolia_evolution.png is a MISSING asset
(referenced in 16_cd1_part3) — pandoc falls back to alt-text; needs the figure
created or the reference removed.

https://claude.ai/code/session_01GMFmEtt6FYiJ4MKzBNCLqb
</commit_message>
<xml_diff>
--- a/dist/chuyen_de_1/15_part2_findings.docx
+++ b/dist/chuyen_de_1/15_part2_findings.docx
@@ -2,7 +2,7 @@
 <file path=word/document.xml><?xml version="1.0" encoding="utf-8"?>
 <w:document xmlns:w="http://schemas.openxmlformats.org/wordprocessingml/2006/main" xmlns:m="http://schemas.openxmlformats.org/officeDocument/2006/math" xmlns:r="http://schemas.openxmlformats.org/officeDocument/2006/relationships" xmlns:o="urn:schemas-microsoft-com:office:office" xmlns:v="urn:schemas-microsoft-com:vml" xmlns:w10="urn:schemas-microsoft-com:office:word" xmlns:a="http://schemas.openxmlformats.org/drawingml/2006/main" xmlns:pic="http://schemas.openxmlformats.org/drawingml/2006/picture" xmlns:wp="http://schemas.openxmlformats.org/drawingml/2006/wordprocessingDrawing">
   <w:body>
-    <w:bookmarkStart w:id="42" w:name="X26e67f3ad01549bdfbc4c8732118186d6b9081c"/>
+    <w:bookmarkStart w:id="60" w:name="X26e67f3ad01549bdfbc4c8732118186d6b9081c"/>
     <w:p>
       <w:pPr>
         <w:pStyle w:val="Heading1"/>
@@ -120,7 +120,7 @@
         </w:pict>
       </w:r>
     </w:p>
-    <w:bookmarkStart w:id="41" w:name="X7d7445c3e22f444c24f6085672cd03a46e26387"/>
+    <w:bookmarkStart w:id="59" w:name="X7d7445c3e22f444c24f6085672cd03a46e26387"/>
     <w:p>
       <w:pPr>
         <w:pStyle w:val="Heading2"/>
@@ -129,7 +129,7 @@
         <w:t xml:space="preserve">CHƯƠNG 4 — THỰC TRẠNG HIỆU QUẢ DOANH NGHIỆP CHÂU Á 2009–2025</w:t>
       </w:r>
     </w:p>
-    <w:bookmarkStart w:id="20" w:name="X47eb90e4cdf5f2f13d93872f397578922bdca81"/>
+    <w:bookmarkStart w:id="26" w:name="X47eb90e4cdf5f2f13d93872f397578922bdca81"/>
     <w:p>
       <w:pPr>
         <w:pStyle w:val="Heading3"/>
@@ -213,7 +213,46 @@
         <w:pStyle w:val="BodyText"/>
       </w:pPr>
       <w:r>
-        <w:t xml:space="preserve">Hình 4.1.1 — Phân bố pool 5 phân nhóm con thể chế (n=101.185 doanh nghiệp)</w:t>
+        <w:drawing>
+          <wp:inline>
+            <wp:extent cx="5753100" cy="3141580"/>
+            <wp:effectExtent b="0" l="0" r="0" t="0"/>
+            <wp:docPr descr="Hình 4.1.1 — Phân bố pool 5 phân nhóm con thể chế (n=101.185 doanh nghiệp)" title="" id="21" name="Picture"/>
+            <a:graphic>
+              <a:graphicData uri="http://schemas.openxmlformats.org/drawingml/2006/picture">
+                <pic:pic>
+                  <pic:nvPicPr>
+                    <pic:cNvPr descr="figures/fig_4_1_pool_composition.png" id="22" name="Picture"/>
+                    <pic:cNvPicPr>
+                      <a:picLocks noChangeArrowheads="1" noChangeAspect="1"/>
+                    </pic:cNvPicPr>
+                  </pic:nvPicPr>
+                  <pic:blipFill>
+                    <a:blip r:embed="rId20"/>
+                    <a:stretch>
+                      <a:fillRect/>
+                    </a:stretch>
+                  </pic:blipFill>
+                  <pic:spPr bwMode="auto">
+                    <a:xfrm>
+                      <a:off x="0" y="0"/>
+                      <a:ext cx="5753100" cy="3141580"/>
+                    </a:xfrm>
+                    <a:prstGeom prst="rect">
+                      <a:avLst/>
+                    </a:prstGeom>
+                    <a:noFill/>
+                    <a:ln w="9525">
+                      <a:noFill/>
+                      <a:headEnd/>
+                      <a:tailEnd/>
+                    </a:ln>
+                  </pic:spPr>
+                </pic:pic>
+              </a:graphicData>
+            </a:graphic>
+          </wp:inline>
+        </w:drawing>
       </w:r>
     </w:p>
     <w:p>
@@ -284,7 +323,46 @@
         <w:pStyle w:val="BodyText"/>
       </w:pPr>
       <w:r>
-        <w:t xml:space="preserve">Hình 4.0 — Phân bố mẫu 101.185 doanh nghiệp xuyên 17 năm (2009–2025) theo 3 thế hệ schema WBES</w:t>
+        <w:drawing>
+          <wp:inline>
+            <wp:extent cx="5753100" cy="2577276"/>
+            <wp:effectExtent b="0" l="0" r="0" t="0"/>
+            <wp:docPr descr="Hình 4.0 — Phân bố mẫu 101.185 doanh nghiệp xuyên 17 năm (2009–2025) theo 3 thế hệ schema WBES" title="" id="24" name="Picture"/>
+            <a:graphic>
+              <a:graphicData uri="http://schemas.openxmlformats.org/drawingml/2006/picture">
+                <pic:pic>
+                  <pic:nvPicPr>
+                    <pic:cNvPr descr="figures/fig_4_0_pool_by_year.png" id="25" name="Picture"/>
+                    <pic:cNvPicPr>
+                      <a:picLocks noChangeArrowheads="1" noChangeAspect="1"/>
+                    </pic:cNvPicPr>
+                  </pic:nvPicPr>
+                  <pic:blipFill>
+                    <a:blip r:embed="rId23"/>
+                    <a:stretch>
+                      <a:fillRect/>
+                    </a:stretch>
+                  </pic:blipFill>
+                  <pic:spPr bwMode="auto">
+                    <a:xfrm>
+                      <a:off x="0" y="0"/>
+                      <a:ext cx="5753100" cy="2577276"/>
+                    </a:xfrm>
+                    <a:prstGeom prst="rect">
+                      <a:avLst/>
+                    </a:prstGeom>
+                    <a:noFill/>
+                    <a:ln w="9525">
+                      <a:noFill/>
+                      <a:headEnd/>
+                      <a:tailEnd/>
+                    </a:ln>
+                  </pic:spPr>
+                </pic:pic>
+              </a:graphicData>
+            </a:graphic>
+          </wp:inline>
+        </w:drawing>
       </w:r>
     </w:p>
     <w:p>
@@ -417,8 +495,8 @@
         <w:t xml:space="preserve">; giới hạn cực trị (winsorize) log năng suất ở mức 1/99 phân vị trong cụm quốc gia × năm. Doanh thu chưa quy đổi sang USD PPP.</w:t>
       </w:r>
     </w:p>
-    <w:bookmarkEnd w:id="20"/>
-    <w:bookmarkStart w:id="21" w:name="Xc2c0ca7aa2dfd6cdea26525f5c28f977cd7a4b9"/>
+    <w:bookmarkEnd w:id="26"/>
+    <w:bookmarkStart w:id="30" w:name="Xc2c0ca7aa2dfd6cdea26525f5c28f977cd7a4b9"/>
     <w:p>
       <w:pPr>
         <w:pStyle w:val="Heading3"/>
@@ -1159,7 +1237,46 @@
         <w:pStyle w:val="BodyText"/>
       </w:pPr>
       <w:r>
-        <w:t xml:space="preserve">Hình 4.2 — Phân phối năng suất theo 6 phân nhóm con (kernel density, n=101.185)</w:t>
+        <w:drawing>
+          <wp:inline>
+            <wp:extent cx="5753100" cy="3401496"/>
+            <wp:effectExtent b="0" l="0" r="0" t="0"/>
+            <wp:docPr descr="Hình 4.2 — Phân phối năng suất theo 6 phân nhóm con (kernel density, n=101.185)" title="" id="28" name="Picture"/>
+            <a:graphic>
+              <a:graphicData uri="http://schemas.openxmlformats.org/drawingml/2006/picture">
+                <pic:pic>
+                  <pic:nvPicPr>
+                    <pic:cNvPr descr="figures/fig_4_2_productivity_density.png" id="29" name="Picture"/>
+                    <pic:cNvPicPr>
+                      <a:picLocks noChangeArrowheads="1" noChangeAspect="1"/>
+                    </pic:cNvPicPr>
+                  </pic:nvPicPr>
+                  <pic:blipFill>
+                    <a:blip r:embed="rId27"/>
+                    <a:stretch>
+                      <a:fillRect/>
+                    </a:stretch>
+                  </pic:blipFill>
+                  <pic:spPr bwMode="auto">
+                    <a:xfrm>
+                      <a:off x="0" y="0"/>
+                      <a:ext cx="5753100" cy="3401496"/>
+                    </a:xfrm>
+                    <a:prstGeom prst="rect">
+                      <a:avLst/>
+                    </a:prstGeom>
+                    <a:noFill/>
+                    <a:ln w="9525">
+                      <a:noFill/>
+                      <a:headEnd/>
+                      <a:tailEnd/>
+                    </a:ln>
+                  </pic:spPr>
+                </pic:pic>
+              </a:graphicData>
+            </a:graphic>
+          </wp:inline>
+        </w:drawing>
       </w:r>
     </w:p>
     <w:p>
@@ -1249,8 +1366,8 @@
         <w:t xml:space="preserve">Hsieh &amp; Klenow (2009, 2014); (3) SIDS ở mức trung bình ~1,32 (v3.1); (4) tỷ số P90/P10 tăng đơn điệu theo phân nhóm con; (5) bằng chứng cho H5 — điều tiết thể chế (institutional moderation).</w:t>
       </w:r>
     </w:p>
-    <w:bookmarkEnd w:id="21"/>
-    <w:bookmarkStart w:id="22" w:name="X49e6a83a3edd7a7248fb949f5c6416aeb2d23bb"/>
+    <w:bookmarkEnd w:id="30"/>
+    <w:bookmarkStart w:id="31" w:name="X49e6a83a3edd7a7248fb949f5c6416aeb2d23bb"/>
     <w:p>
       <w:pPr>
         <w:pStyle w:val="Heading3"/>
@@ -1609,8 +1726,8 @@
         <w:t xml:space="preserve">Trung vị FSTS bằng 0% — phân phối phân cực mạnh; SIDS có CAGR việc làm cao nhất.</w:t>
       </w:r>
     </w:p>
-    <w:bookmarkEnd w:id="22"/>
-    <w:bookmarkStart w:id="26" w:name="X9da48440be0f68d2ca17e87929ae187af48e20c"/>
+    <w:bookmarkEnd w:id="31"/>
+    <w:bookmarkStart w:id="35" w:name="X9da48440be0f68d2ca17e87929ae187af48e20c"/>
     <w:p>
       <w:pPr>
         <w:pStyle w:val="Heading3"/>
@@ -1619,7 +1736,7 @@
         <w:t xml:space="preserve">4.4 Thực trạng đổi mới sáng tạo và năng lực số</w:t>
       </w:r>
     </w:p>
-    <w:bookmarkStart w:id="23" w:name="X9b69c66241ca10117bab41129d52be8e3213a5b"/>
+    <w:bookmarkStart w:id="32" w:name="X9b69c66241ca10117bab41129d52be8e3213a5b"/>
     <w:p>
       <w:pPr>
         <w:pStyle w:val="Heading4"/>
@@ -2837,8 +2954,8 @@
         <w:t xml:space="preserve">; phân tách rõ Năng lực công nghệ (TCI) so với Năng lực số (DAI) — kế thừa Đỗ &amp; Phan (2026 — VEFR).</w:t>
       </w:r>
     </w:p>
-    <w:bookmarkEnd w:id="23"/>
-    <w:bookmarkStart w:id="24" w:name="X0e36d2ac3de1653c330320ad0d0ed4280ae22ec"/>
+    <w:bookmarkEnd w:id="32"/>
+    <w:bookmarkStart w:id="33" w:name="X0e36d2ac3de1653c330320ad0d0ed4280ae22ec"/>
     <w:p>
       <w:pPr>
         <w:pStyle w:val="Heading4"/>
@@ -3093,8 +3210,8 @@
         <w:t xml:space="preserve">(business models reshaped — kế thừa Banalieva &amp; Dhanaraj, 2019 layered framework).</w:t>
       </w:r>
     </w:p>
-    <w:bookmarkEnd w:id="24"/>
-    <w:bookmarkStart w:id="25" w:name="Xc93e2c40efba7dc00d5f6210aea0ec8c7a942df"/>
+    <w:bookmarkEnd w:id="33"/>
+    <w:bookmarkStart w:id="34" w:name="Xc93e2c40efba7dc00d5f6210aea0ec8c7a942df"/>
     <w:p>
       <w:pPr>
         <w:pStyle w:val="Heading4"/>
@@ -3649,9 +3766,9 @@
         <w:t xml:space="preserve">: Cross-validation construct boundary — chạy Spec 2 chỉ ở 41 nước có đủ Tier 1+2 data (BREADY+ wave); confirm rằng pattern Singapore-style (DAI × FSTS² dương) emerges khi có composite digital adoption metric. Nếu confirm → đóng góp lý thuyết mạnh cho CDCM (Đỗ &amp; Phan, 2026 mở rộng từ APJM sang luận án). Nếu không confirm → cần Tier 3 (ERP/CRM) hoặc Tier 4 (AI) để nắm cơ chế thực sự — hàm ý cho data collection tương lai (limitations §7.3.4 file 16).</w:t>
       </w:r>
     </w:p>
-    <w:bookmarkEnd w:id="25"/>
-    <w:bookmarkEnd w:id="26"/>
-    <w:bookmarkStart w:id="29" w:name="X6e67086062c2d278d9098d05d76f4a8c0ad80a9"/>
+    <w:bookmarkEnd w:id="34"/>
+    <w:bookmarkEnd w:id="35"/>
+    <w:bookmarkStart w:id="41" w:name="X6e67086062c2d278d9098d05d76f4a8c0ad80a9"/>
     <w:p>
       <w:pPr>
         <w:pStyle w:val="Heading3"/>
@@ -4023,7 +4140,46 @@
         <w:pStyle w:val="BodyText"/>
       </w:pPr>
       <w:r>
-        <w:t xml:space="preserve">Hình 4.6 — Phân phối quy mô doanh nghiệp theo phân nhóm con (n=101.185)</w:t>
+        <w:drawing>
+          <wp:inline>
+            <wp:extent cx="5753100" cy="3545232"/>
+            <wp:effectExtent b="0" l="0" r="0" t="0"/>
+            <wp:docPr descr="Hình 4.6 — Phân phối quy mô doanh nghiệp theo phân nhóm con (n=101.185)" title="" id="37" name="Picture"/>
+            <a:graphic>
+              <a:graphicData uri="http://schemas.openxmlformats.org/drawingml/2006/picture">
+                <pic:pic>
+                  <pic:nvPicPr>
+                    <pic:cNvPr descr="figures/fig_4_6_firm_size.png" id="38" name="Picture"/>
+                    <pic:cNvPicPr>
+                      <a:picLocks noChangeArrowheads="1" noChangeAspect="1"/>
+                    </pic:cNvPicPr>
+                  </pic:nvPicPr>
+                  <pic:blipFill>
+                    <a:blip r:embed="rId36"/>
+                    <a:stretch>
+                      <a:fillRect/>
+                    </a:stretch>
+                  </pic:blipFill>
+                  <pic:spPr bwMode="auto">
+                    <a:xfrm>
+                      <a:off x="0" y="0"/>
+                      <a:ext cx="5753100" cy="3545232"/>
+                    </a:xfrm>
+                    <a:prstGeom prst="rect">
+                      <a:avLst/>
+                    </a:prstGeom>
+                    <a:noFill/>
+                    <a:ln w="9525">
+                      <a:noFill/>
+                      <a:headEnd/>
+                      <a:tailEnd/>
+                    </a:ln>
+                  </pic:spPr>
+                </pic:pic>
+              </a:graphicData>
+            </a:graphic>
+          </wp:inline>
+        </w:drawing>
       </w:r>
     </w:p>
     <w:p>
@@ -4089,7 +4245,7 @@
         <w:t xml:space="preserve">.</w:t>
       </w:r>
     </w:p>
-    <w:bookmarkStart w:id="27" w:name="X9476a1a8fffd24dba67dea0749f7b6a1e9907cc"/>
+    <w:bookmarkStart w:id="39" w:name="X9476a1a8fffd24dba67dea0749f7b6a1e9907cc"/>
     <w:p>
       <w:pPr>
         <w:pStyle w:val="Heading4"/>
@@ -5110,8 +5266,8 @@
         <w:t xml:space="preserve">— không chỉ 2 lĩnh vực (đổi mới + năng lực số) như §4.4 hiện đang phân tích.</w:t>
       </w:r>
     </w:p>
-    <w:bookmarkEnd w:id="27"/>
-    <w:bookmarkStart w:id="28" w:name="X29668a08035432e8f39a3dfa599c3d6a9d31d49"/>
+    <w:bookmarkEnd w:id="39"/>
+    <w:bookmarkStart w:id="40" w:name="X29668a08035432e8f39a3dfa599c3d6a9d31d49"/>
     <w:p>
       <w:pPr>
         <w:pStyle w:val="Heading4"/>
@@ -5804,9 +5960,9 @@
         <w:t xml:space="preserve">). Carboni et al. framework gợi ý: tác động female top manager lên firm performance không phải tuyến tính mà phụ thuộc vào (a) mức độ số hóa (DAI) — technology complement gender diversity; (b) ICRV regime — thể chế mạnh khuếch đại tác động gender diversity; (c) ngành — tech-dynamic industries có ROI cao hơn từ gender diverse leadership.</w:t>
       </w:r>
     </w:p>
-    <w:bookmarkEnd w:id="28"/>
-    <w:bookmarkEnd w:id="29"/>
-    <w:bookmarkStart w:id="30" w:name="X6391a3bb9aef206e09a1ede1e8a14537396c493"/>
+    <w:bookmarkEnd w:id="40"/>
+    <w:bookmarkEnd w:id="41"/>
+    <w:bookmarkStart w:id="48" w:name="X6391a3bb9aef206e09a1ede1e8a14537396c493"/>
     <w:p>
       <w:pPr>
         <w:pStyle w:val="Heading3"/>
@@ -6242,7 +6398,46 @@
         <w:pStyle w:val="BodyText"/>
       </w:pPr>
       <w:r>
-        <w:t xml:space="preserve">Hình 4.4 — Slope chart 2009–2012 vs 2018–2025 (Δ điểm phần trăm 5 chỉ số)</w:t>
+        <w:drawing>
+          <wp:inline>
+            <wp:extent cx="5753100" cy="2590690"/>
+            <wp:effectExtent b="0" l="0" r="0" t="0"/>
+            <wp:docPr descr="Hình 4.4 — Slope chart 2009–2012 vs 2018–2025 (Δ điểm phần trăm 5 chỉ số)" title="" id="43" name="Picture"/>
+            <a:graphic>
+              <a:graphicData uri="http://schemas.openxmlformats.org/drawingml/2006/picture">
+                <pic:pic>
+                  <pic:nvPicPr>
+                    <pic:cNvPr descr="figures/fig_4_4_growth_pathway.png" id="44" name="Picture"/>
+                    <pic:cNvPicPr>
+                      <a:picLocks noChangeArrowheads="1" noChangeAspect="1"/>
+                    </pic:cNvPicPr>
+                  </pic:nvPicPr>
+                  <pic:blipFill>
+                    <a:blip r:embed="rId42"/>
+                    <a:stretch>
+                      <a:fillRect/>
+                    </a:stretch>
+                  </pic:blipFill>
+                  <pic:spPr bwMode="auto">
+                    <a:xfrm>
+                      <a:off x="0" y="0"/>
+                      <a:ext cx="5753100" cy="2590690"/>
+                    </a:xfrm>
+                    <a:prstGeom prst="rect">
+                      <a:avLst/>
+                    </a:prstGeom>
+                    <a:noFill/>
+                    <a:ln w="9525">
+                      <a:noFill/>
+                      <a:headEnd/>
+                      <a:tailEnd/>
+                    </a:ln>
+                  </pic:spPr>
+                </pic:pic>
+              </a:graphicData>
+            </a:graphic>
+          </wp:inline>
+        </w:drawing>
       </w:r>
     </w:p>
     <w:p>
@@ -6313,7 +6508,46 @@
         <w:pStyle w:val="BodyText"/>
       </w:pPr>
       <w:r>
-        <w:t xml:space="preserve">Hình 4.7 — Spider chart 5 chiều × 2 mốc thời gian (Advanced, Emerging, SIDS)</w:t>
+        <w:drawing>
+          <wp:inline>
+            <wp:extent cx="5753100" cy="2222977"/>
+            <wp:effectExtent b="0" l="0" r="0" t="0"/>
+            <wp:docPr descr="Hình 4.7 — Spider chart 5 chiều × 2 mốc thời gian (Advanced, Emerging, SIDS)" title="" id="46" name="Picture"/>
+            <a:graphic>
+              <a:graphicData uri="http://schemas.openxmlformats.org/drawingml/2006/picture">
+                <pic:pic>
+                  <pic:nvPicPr>
+                    <pic:cNvPr descr="figures/fig_4_7_spider_chart.png" id="47" name="Picture"/>
+                    <pic:cNvPicPr>
+                      <a:picLocks noChangeArrowheads="1" noChangeAspect="1"/>
+                    </pic:cNvPicPr>
+                  </pic:nvPicPr>
+                  <pic:blipFill>
+                    <a:blip r:embed="rId45"/>
+                    <a:stretch>
+                      <a:fillRect/>
+                    </a:stretch>
+                  </pic:blipFill>
+                  <pic:spPr bwMode="auto">
+                    <a:xfrm>
+                      <a:off x="0" y="0"/>
+                      <a:ext cx="5753100" cy="2222977"/>
+                    </a:xfrm>
+                    <a:prstGeom prst="rect">
+                      <a:avLst/>
+                    </a:prstGeom>
+                    <a:noFill/>
+                    <a:ln w="9525">
+                      <a:noFill/>
+                      <a:headEnd/>
+                      <a:tailEnd/>
+                    </a:ln>
+                  </pic:spPr>
+                </pic:pic>
+              </a:graphicData>
+            </a:graphic>
+          </wp:inline>
+        </w:drawing>
       </w:r>
     </w:p>
     <w:p>
@@ -6379,8 +6613,8 @@
         <w:t xml:space="preserve">.</w:t>
       </w:r>
     </w:p>
-    <w:bookmarkEnd w:id="30"/>
-    <w:bookmarkStart w:id="32" w:name="X47afba15eda09d6304b88468d99af6dab5ef69e"/>
+    <w:bookmarkEnd w:id="48"/>
+    <w:bookmarkStart w:id="50" w:name="X47afba15eda09d6304b88468d99af6dab5ef69e"/>
     <w:p>
       <w:pPr>
         <w:pStyle w:val="Heading3"/>
@@ -6982,7 +7216,7 @@
         <w:t xml:space="preserve">: hồi quy đa biến (CĐ2); panel/IV identification (CĐ2); industry-level descriptive tables (Phase 2 7/2026); năng suất USD PPP (Phase 1 6/2026); resource dependence trực tiếp (Phase 1).</w:t>
       </w:r>
     </w:p>
-    <w:bookmarkStart w:id="31" w:name="Xf63aadf8066ea37d60f1882df941c784fa6d787"/>
+    <w:bookmarkStart w:id="49" w:name="Xf63aadf8066ea37d60f1882df941c784fa6d787"/>
     <w:p>
       <w:pPr>
         <w:pStyle w:val="Heading4"/>
@@ -7922,9 +8156,9 @@
         <w:t xml:space="preserve">.</w:t>
       </w:r>
     </w:p>
-    <w:bookmarkEnd w:id="31"/>
-    <w:bookmarkEnd w:id="32"/>
-    <w:bookmarkStart w:id="33" w:name="X5b86ef82f02a3f57b151c9c771399d7d901d53b"/>
+    <w:bookmarkEnd w:id="49"/>
+    <w:bookmarkEnd w:id="50"/>
+    <w:bookmarkStart w:id="51" w:name="X5b86ef82f02a3f57b151c9c771399d7d901d53b"/>
     <w:p>
       <w:pPr>
         <w:pStyle w:val="Heading3"/>
@@ -9213,8 +9447,8 @@
         <w:t xml:space="preserve">— bảng Industry × Institutional Quality interaction cần thiết để confirm/disconfirm H1-H2 của Kafouros với 41 nước châu Á (vs 16 nước CEE của Kafouros). Nếu interaction tech_dynamism × institutional_quality dương và significant ở mức p&lt;.05, đây là evidence châu Á-specific cho industry-bounded institutional advantage — đóng góp lý thuyết của luận án.</w:t>
       </w:r>
     </w:p>
-    <w:bookmarkEnd w:id="33"/>
-    <w:bookmarkStart w:id="34" w:name="X71a74cdd34152b5a74aff8a8052f8472d9562d0"/>
+    <w:bookmarkEnd w:id="51"/>
+    <w:bookmarkStart w:id="52" w:name="X71a74cdd34152b5a74aff8a8052f8472d9562d0"/>
     <w:p>
       <w:pPr>
         <w:pStyle w:val="Heading3"/>
@@ -9924,8 +10158,8 @@
         <w:t xml:space="preserve">Năm phát hiện: (1) FSTS phân tầng 5,0%-7,2%-13,2% bị che giấu; (2) FDI chênh lệch 6× ASEAN-3 vs Nam Á+Tây Á; (3) TCI ngược dấu; (4) Mongolia boundary case; (5) sd log 1,53 vs 1,16 — two-tier (Hsieh &amp; Klenow, 2009).</w:t>
       </w:r>
     </w:p>
-    <w:bookmarkEnd w:id="34"/>
-    <w:bookmarkStart w:id="35" w:name="Xff4a512a3a7369f731f273600b6b6df89aaf71a"/>
+    <w:bookmarkEnd w:id="52"/>
+    <w:bookmarkStart w:id="53" w:name="Xff4a512a3a7369f731f273600b6b6df89aaf71a"/>
     <w:p>
       <w:pPr>
         <w:pStyle w:val="Heading3"/>
@@ -11974,8 +12208,8 @@
         <w:t xml:space="preserve">.</w:t>
       </w:r>
     </w:p>
-    <w:bookmarkEnd w:id="35"/>
-    <w:bookmarkStart w:id="40" w:name="X3ee548cfa3fb9cd93772514558d03d29daa2344"/>
+    <w:bookmarkEnd w:id="53"/>
+    <w:bookmarkStart w:id="58" w:name="X3ee548cfa3fb9cd93772514558d03d29daa2344"/>
     <w:p>
       <w:pPr>
         <w:pStyle w:val="Heading3"/>
@@ -12050,7 +12284,7 @@
         <w:t xml:space="preserve">NCS đã có cảnh báo trong §4.10 (mục 5: R&amp;D schema-induced overestimation) nhưng cần làm sâu hơn với 3 đề xuất phương pháp luận.</w:t>
       </w:r>
     </w:p>
-    <w:bookmarkStart w:id="36" w:name="X89a400c48edb7a048019b34ecd59b368db1ed89"/>
+    <w:bookmarkStart w:id="54" w:name="X89a400c48edb7a048019b34ecd59b368db1ed89"/>
     <w:p>
       <w:pPr>
         <w:pStyle w:val="Heading4"/>
@@ -12185,8 +12419,8 @@
         <w:t xml:space="preserve">vào Spec 1 (full pool, 101.185 firms) và Spec 2 (2018-2025, ~50.000 firms) cho CĐ2.</w:t>
       </w:r>
     </w:p>
-    <w:bookmarkEnd w:id="36"/>
-    <w:bookmarkStart w:id="37" w:name="X8cc0e76babbea10c6d363d660f0bb9305a8e514"/>
+    <w:bookmarkEnd w:id="54"/>
+    <w:bookmarkStart w:id="55" w:name="X8cc0e76babbea10c6d363d660f0bb9305a8e514"/>
     <w:p>
       <w:pPr>
         <w:pStyle w:val="Heading4"/>
@@ -12368,8 +12602,8 @@
         <w:t xml:space="preserve">(sau Manufacturing-only, ICT-excluded, Tourism-separated SIDS, Construction-tested Gulf, Mining-excluded resource).</w:t>
       </w:r>
     </w:p>
-    <w:bookmarkEnd w:id="37"/>
-    <w:bookmarkStart w:id="38" w:name="Xab69fcb55f0effc3845a43884fac9132a0be221"/>
+    <w:bookmarkEnd w:id="55"/>
+    <w:bookmarkStart w:id="56" w:name="Xab69fcb55f0effc3845a43884fac9132a0be221"/>
     <w:p>
       <w:pPr>
         <w:pStyle w:val="Heading4"/>
@@ -12548,8 +12782,8 @@
         <w:t xml:space="preserve">"Biến rủi ro dữ liệu thành chương phân tích hướng tới tương lai cực kỳ giá trị."</w:t>
       </w:r>
     </w:p>
-    <w:bookmarkEnd w:id="38"/>
-    <w:bookmarkStart w:id="39" w:name="X4d66f53d7d10335ba04975d38364e940e33b415"/>
+    <w:bookmarkEnd w:id="56"/>
+    <w:bookmarkStart w:id="57" w:name="X4d66f53d7d10335ba04975d38364e940e33b415"/>
     <w:p>
       <w:pPr>
         <w:pStyle w:val="Heading4"/>
@@ -12814,10 +13048,10 @@
         </w:pict>
       </w:r>
     </w:p>
-    <w:bookmarkEnd w:id="39"/>
-    <w:bookmarkEnd w:id="40"/>
-    <w:bookmarkEnd w:id="41"/>
-    <w:bookmarkEnd w:id="42"/>
+    <w:bookmarkEnd w:id="57"/>
+    <w:bookmarkEnd w:id="58"/>
+    <w:bookmarkEnd w:id="59"/>
+    <w:bookmarkEnd w:id="60"/>
     <w:sectPr>
       <w:pgSz w:h="16838" w:w="11906"/>
       <w:pgMar w:bottom="1134" w:left="1701" w:right="1134" w:top="1134"/>

</xml_diff>